<commit_message>
Docs: export final sesiune 2026-04-03 (fix footer + documentatie profesor)
Co-Authored-By: Claude Sonnet 4.6 <noreply@anthropic.com>
</commit_message>
<xml_diff>
--- a/docs/sesiune-2026-04-03.docx
+++ b/docs/sesiune-2026-04-03.docx
@@ -16240,6 +16240,1724 @@
           <w:szCs w:val="20"/>
         </w:rPr>
         <w:t xml:space="preserve">**Toate modificările sunt live pe Vercel.**</w:t>
+      </w:r>
+    </w:p>
+    <w:p>
+      <w:pPr>
+        <w:spacing w:after="60"/>
+      </w:pPr>
+      <w:r>
+        <w:rPr>
+          <w:rFonts w:ascii="DejaVu Sans" w:cs="DejaVu Sans" w:eastAsia="DejaVu Sans" w:hAnsi="DejaVu Sans"/>
+          <w:color w:val="111827"/>
+          <w:sz w:val="20"/>
+          <w:szCs w:val="20"/>
+        </w:rPr>
+        <w:t xml:space="preserve"> </w:t>
+      </w:r>
+    </w:p>
+    <w:p>
+      <w:pPr>
+        <w:spacing w:after="60"/>
+      </w:pPr>
+      <w:r>
+        <w:rPr>
+          <w:rFonts w:ascii="DejaVu Sans" w:cs="DejaVu Sans" w:eastAsia="DejaVu Sans" w:hAnsi="DejaVu Sans"/>
+          <w:color w:val="111827"/>
+          <w:sz w:val="20"/>
+          <w:szCs w:val="20"/>
+        </w:rPr>
+        <w:t xml:space="preserve">---</w:t>
+      </w:r>
+    </w:p>
+    <w:p>
+      <w:pPr>
+        <w:spacing w:after="60"/>
+      </w:pPr>
+      <w:r>
+        <w:rPr>
+          <w:rFonts w:ascii="DejaVu Sans" w:cs="DejaVu Sans" w:eastAsia="DejaVu Sans" w:hAnsi="DejaVu Sans"/>
+          <w:color w:val="111827"/>
+          <w:sz w:val="20"/>
+          <w:szCs w:val="20"/>
+        </w:rPr>
+        <w:t xml:space="preserve"> </w:t>
+      </w:r>
+    </w:p>
+    <w:p>
+      <w:pPr>
+        <w:spacing w:after="60"/>
+      </w:pPr>
+      <w:r>
+        <w:rPr>
+          <w:rFonts w:ascii="DejaVu Sans" w:cs="DejaVu Sans" w:eastAsia="DejaVu Sans" w:hAnsi="DejaVu Sans"/>
+          <w:color w:val="111827"/>
+          <w:sz w:val="20"/>
+          <w:szCs w:val="20"/>
+        </w:rPr>
+        <w:t xml:space="preserve">Ai un to-do list pentru sesiunea viitoare?</w:t>
+      </w:r>
+    </w:p>
+    <w:p>
+      <w:pPr>
+        <w:pBdr>
+          <w:bottom w:val="single" w:color="E5E7EB" w:sz="1"/>
+        </w:pBdr>
+        <w:spacing w:after="200"/>
+      </w:pPr>
+    </w:p>
+    <w:p>
+      <w:pPr>
+        <w:spacing w:after="100" w:before="300"/>
+      </w:pPr>
+      <w:r>
+        <w:rPr>
+          <w:b/>
+          <w:bCs/>
+          <w:color w:val="1D4ED8"/>
+          <w:sz w:val="22"/>
+          <w:szCs w:val="22"/>
+        </w:rPr>
+        <w:t xml:space="preserve">👤 Tu</w:t>
+      </w:r>
+    </w:p>
+    <w:p>
+      <w:pPr>
+        <w:spacing w:after="60"/>
+      </w:pPr>
+      <w:r>
+        <w:rPr>
+          <w:rFonts w:ascii="DejaVu Sans" w:cs="DejaVu Sans" w:eastAsia="DejaVu Sans" w:hAnsi="DejaVu Sans"/>
+          <w:color w:val="111827"/>
+          <w:sz w:val="20"/>
+          <w:szCs w:val="20"/>
+        </w:rPr>
+        <w:t xml:space="preserve">nu</w:t>
+      </w:r>
+    </w:p>
+    <w:p>
+      <w:pPr>
+        <w:pBdr>
+          <w:bottom w:val="single" w:color="E5E7EB" w:sz="1"/>
+        </w:pBdr>
+        <w:spacing w:after="200"/>
+      </w:pPr>
+    </w:p>
+    <w:p>
+      <w:pPr>
+        <w:spacing w:after="100" w:before="300"/>
+      </w:pPr>
+      <w:r>
+        <w:rPr>
+          <w:b/>
+          <w:bCs/>
+          <w:color w:val="065F46"/>
+          <w:sz w:val="22"/>
+          <w:szCs w:val="22"/>
+        </w:rPr>
+        <w:t xml:space="preserve">🤖 Claude</w:t>
+      </w:r>
+    </w:p>
+    <w:p>
+      <w:pPr>
+        <w:spacing w:after="60"/>
+      </w:pPr>
+      <w:r>
+        <w:rPr>
+          <w:rFonts w:ascii="DejaVu Sans" w:cs="DejaVu Sans" w:eastAsia="DejaVu Sans" w:hAnsi="DejaVu Sans"/>
+          <w:color w:val="111827"/>
+          <w:sz w:val="20"/>
+          <w:szCs w:val="20"/>
+        </w:rPr>
+        <w:t xml:space="preserve">Sesiunea exportată și salvată pe GitHub. La revedere!</w:t>
+      </w:r>
+    </w:p>
+    <w:p>
+      <w:pPr>
+        <w:pBdr>
+          <w:bottom w:val="single" w:color="E5E7EB" w:sz="1"/>
+        </w:pBdr>
+        <w:spacing w:after="200"/>
+      </w:pPr>
+    </w:p>
+    <w:p>
+      <w:pPr>
+        <w:spacing w:after="100" w:before="300"/>
+      </w:pPr>
+      <w:r>
+        <w:rPr>
+          <w:b/>
+          <w:bCs/>
+          <w:color w:val="1D4ED8"/>
+          <w:sz w:val="22"/>
+          <w:szCs w:val="22"/>
+        </w:rPr>
+        <w:t xml:space="preserve">👤 Tu</w:t>
+      </w:r>
+    </w:p>
+    <w:p>
+      <w:pPr>
+        <w:spacing w:after="60"/>
+      </w:pPr>
+      <w:r>
+        <w:rPr>
+          <w:rFonts w:ascii="DejaVu Sans" w:cs="DejaVu Sans" w:eastAsia="DejaVu Sans" w:hAnsi="DejaVu Sans"/>
+          <w:color w:val="111827"/>
+          <w:sz w:val="20"/>
+          <w:szCs w:val="20"/>
+        </w:rPr>
+        <w:t xml:space="preserve">Facem acum un rezumat profesionist la proiect</w:t>
+      </w:r>
+    </w:p>
+    <w:p>
+      <w:pPr>
+        <w:pBdr>
+          <w:bottom w:val="single" w:color="E5E7EB" w:sz="1"/>
+        </w:pBdr>
+        <w:spacing w:after="200"/>
+      </w:pPr>
+    </w:p>
+    <w:p>
+      <w:pPr>
+        <w:spacing w:after="100" w:before="300"/>
+      </w:pPr>
+      <w:r>
+        <w:rPr>
+          <w:b/>
+          <w:bCs/>
+          <w:color w:val="065F46"/>
+          <w:sz w:val="22"/>
+          <w:szCs w:val="22"/>
+        </w:rPr>
+        <w:t xml:space="preserve">🤖 Claude</w:t>
+      </w:r>
+    </w:p>
+    <w:p>
+      <w:pPr>
+        <w:spacing w:after="60"/>
+      </w:pPr>
+      <w:r>
+        <w:rPr>
+          <w:rFonts w:ascii="DejaVu Sans" w:cs="DejaVu Sans" w:eastAsia="DejaVu Sans" w:hAnsi="DejaVu Sans"/>
+          <w:color w:val="111827"/>
+          <w:sz w:val="20"/>
+          <w:szCs w:val="20"/>
+        </w:rPr>
+        <w:t xml:space="preserve">Acum generez rezumatul profesionist. Ce format vrei — **DOCX + PDF** ca celelalte documente, sau vrei să-l văd mai întâi ca text aici?</w:t>
+      </w:r>
+    </w:p>
+    <w:p>
+      <w:pPr>
+        <w:pBdr>
+          <w:bottom w:val="single" w:color="E5E7EB" w:sz="1"/>
+        </w:pBdr>
+        <w:spacing w:after="200"/>
+      </w:pPr>
+    </w:p>
+    <w:p>
+      <w:pPr>
+        <w:spacing w:after="100" w:before="300"/>
+      </w:pPr>
+      <w:r>
+        <w:rPr>
+          <w:b/>
+          <w:bCs/>
+          <w:color w:val="1D4ED8"/>
+          <w:sz w:val="22"/>
+          <w:szCs w:val="22"/>
+        </w:rPr>
+        <w:t xml:space="preserve">👤 Tu</w:t>
+      </w:r>
+    </w:p>
+    <w:p>
+      <w:pPr>
+        <w:spacing w:after="60"/>
+      </w:pPr>
+      <w:r>
+        <w:rPr>
+          <w:rFonts w:ascii="DejaVu Sans" w:cs="DejaVu Sans" w:eastAsia="DejaVu Sans" w:hAnsi="DejaVu Sans"/>
+          <w:color w:val="111827"/>
+          <w:sz w:val="20"/>
+          <w:szCs w:val="20"/>
+        </w:rPr>
+        <w:t xml:space="preserve">nu</w:t>
+      </w:r>
+    </w:p>
+    <w:p>
+      <w:pPr>
+        <w:pBdr>
+          <w:bottom w:val="single" w:color="E5E7EB" w:sz="1"/>
+        </w:pBdr>
+        <w:spacing w:after="200"/>
+      </w:pPr>
+    </w:p>
+    <w:p>
+      <w:pPr>
+        <w:spacing w:after="100" w:before="300"/>
+      </w:pPr>
+      <w:r>
+        <w:rPr>
+          <w:b/>
+          <w:bCs/>
+          <w:color w:val="065F46"/>
+          <w:sz w:val="22"/>
+          <w:szCs w:val="22"/>
+        </w:rPr>
+        <w:t xml:space="preserve">🤖 Claude</w:t>
+      </w:r>
+    </w:p>
+    <w:p>
+      <w:pPr>
+        <w:spacing w:after="60"/>
+      </w:pPr>
+      <w:r>
+        <w:rPr>
+          <w:rFonts w:ascii="DejaVu Sans" w:cs="DejaVu Sans" w:eastAsia="DejaVu Sans" w:hAnsi="DejaVu Sans"/>
+          <w:color w:val="111827"/>
+          <w:sz w:val="20"/>
+          <w:szCs w:val="20"/>
+        </w:rPr>
+        <w:t xml:space="preserve">Voi crea un script nou pentru rezumatul profesionist al întregului proiect:</w:t>
+      </w:r>
+    </w:p>
+    <w:p>
+      <w:pPr>
+        <w:pBdr>
+          <w:bottom w:val="single" w:color="E5E7EB" w:sz="1"/>
+        </w:pBdr>
+        <w:spacing w:after="200"/>
+      </w:pPr>
+    </w:p>
+    <w:p>
+      <w:pPr>
+        <w:spacing w:after="100" w:before="300"/>
+      </w:pPr>
+      <w:r>
+        <w:rPr>
+          <w:b/>
+          <w:bCs/>
+          <w:color w:val="065F46"/>
+          <w:sz w:val="22"/>
+          <w:szCs w:val="22"/>
+        </w:rPr>
+        <w:t xml:space="preserve">🤖 Claude</w:t>
+      </w:r>
+    </w:p>
+    <w:p>
+      <w:pPr>
+        <w:spacing w:after="60"/>
+      </w:pPr>
+      <w:r>
+        <w:rPr>
+          <w:rFonts w:ascii="DejaVu Sans" w:cs="DejaVu Sans" w:eastAsia="DejaVu Sans" w:hAnsi="DejaVu Sans"/>
+          <w:color w:val="111827"/>
+          <w:sz w:val="20"/>
+          <w:szCs w:val="20"/>
+        </w:rPr>
+        <w:t xml:space="preserve">PDF-ul se generează asincron. Aștept puțin:</w:t>
+      </w:r>
+    </w:p>
+    <w:p>
+      <w:pPr>
+        <w:pBdr>
+          <w:bottom w:val="single" w:color="E5E7EB" w:sz="1"/>
+        </w:pBdr>
+        <w:spacing w:after="200"/>
+      </w:pPr>
+    </w:p>
+    <w:p>
+      <w:pPr>
+        <w:spacing w:after="100" w:before="300"/>
+      </w:pPr>
+      <w:r>
+        <w:rPr>
+          <w:b/>
+          <w:bCs/>
+          <w:color w:val="065F46"/>
+          <w:sz w:val="22"/>
+          <w:szCs w:val="22"/>
+        </w:rPr>
+        <w:t xml:space="preserve">🤖 Claude</w:t>
+      </w:r>
+    </w:p>
+    <w:p>
+      <w:pPr>
+        <w:spacing w:after="60"/>
+      </w:pPr>
+      <w:r>
+        <w:rPr>
+          <w:rFonts w:ascii="DejaVu Sans" w:cs="DejaVu Sans" w:eastAsia="DejaVu Sans" w:hAnsi="DejaVu Sans"/>
+          <w:color w:val="111827"/>
+          <w:sz w:val="20"/>
+          <w:szCs w:val="20"/>
+        </w:rPr>
+        <w:t xml:space="preserve">Văd — `createPdf` în proiect e un PDF kit (pdfkit), nu HTML-to-PDF. Scriptul meu a apelat greșit. Fixez rapid:</w:t>
+      </w:r>
+    </w:p>
+    <w:p>
+      <w:pPr>
+        <w:pBdr>
+          <w:bottom w:val="single" w:color="E5E7EB" w:sz="1"/>
+        </w:pBdr>
+        <w:spacing w:after="200"/>
+      </w:pPr>
+    </w:p>
+    <w:p>
+      <w:pPr>
+        <w:spacing w:after="100" w:before="300"/>
+      </w:pPr>
+      <w:r>
+        <w:rPr>
+          <w:b/>
+          <w:bCs/>
+          <w:color w:val="065F46"/>
+          <w:sz w:val="22"/>
+          <w:szCs w:val="22"/>
+        </w:rPr>
+        <w:t xml:space="preserve">🤖 Claude</w:t>
+      </w:r>
+    </w:p>
+    <w:p>
+      <w:pPr>
+        <w:spacing w:after="60"/>
+      </w:pPr>
+      <w:r>
+        <w:rPr>
+          <w:rFonts w:ascii="DejaVu Sans" w:cs="DejaVu Sans" w:eastAsia="DejaVu Sans" w:hAnsi="DejaVu Sans"/>
+          <w:color w:val="111827"/>
+          <w:sz w:val="20"/>
+          <w:szCs w:val="20"/>
+        </w:rPr>
+        <w:t xml:space="preserve">Acum știu cum funcționează — e PDFKit. Actualizez scriptul cu generarea PDF corectă:</w:t>
+      </w:r>
+    </w:p>
+    <w:p>
+      <w:pPr>
+        <w:pBdr>
+          <w:bottom w:val="single" w:color="E5E7EB" w:sz="1"/>
+        </w:pBdr>
+        <w:spacing w:after="200"/>
+      </w:pPr>
+    </w:p>
+    <w:p>
+      <w:pPr>
+        <w:spacing w:after="100" w:before="300"/>
+      </w:pPr>
+      <w:r>
+        <w:rPr>
+          <w:b/>
+          <w:bCs/>
+          <w:color w:val="065F46"/>
+          <w:sz w:val="22"/>
+          <w:szCs w:val="22"/>
+        </w:rPr>
+        <w:t xml:space="preserve">🤖 Claude</w:t>
+      </w:r>
+    </w:p>
+    <w:p>
+      <w:pPr>
+        <w:spacing w:after="60"/>
+      </w:pPr>
+      <w:r>
+        <w:rPr>
+          <w:rFonts w:ascii="DejaVu Sans" w:cs="DejaVu Sans" w:eastAsia="DejaVu Sans" w:hAnsi="DejaVu Sans"/>
+          <w:color w:val="111827"/>
+          <w:sz w:val="20"/>
+          <w:szCs w:val="20"/>
+        </w:rPr>
+        <w:t xml:space="preserve">Înlocuiesc toată secțiunea de generare PDF cu PDFKit corect:</w:t>
+      </w:r>
+    </w:p>
+    <w:p>
+      <w:pPr>
+        <w:pBdr>
+          <w:bottom w:val="single" w:color="E5E7EB" w:sz="1"/>
+        </w:pBdr>
+        <w:spacing w:after="200"/>
+      </w:pPr>
+    </w:p>
+    <w:p>
+      <w:pPr>
+        <w:spacing w:after="100" w:before="300"/>
+      </w:pPr>
+      <w:r>
+        <w:rPr>
+          <w:b/>
+          <w:bCs/>
+          <w:color w:val="065F46"/>
+          <w:sz w:val="22"/>
+          <w:szCs w:val="22"/>
+        </w:rPr>
+        <w:t xml:space="preserve">🤖 Claude</w:t>
+      </w:r>
+    </w:p>
+    <w:p>
+      <w:pPr>
+        <w:spacing w:after="60"/>
+      </w:pPr>
+      <w:r>
+        <w:rPr>
+          <w:rFonts w:ascii="DejaVu Sans" w:cs="DejaVu Sans" w:eastAsia="DejaVu Sans" w:hAnsi="DejaVu Sans"/>
+          <w:color w:val="111827"/>
+          <w:sz w:val="20"/>
+          <w:szCs w:val="20"/>
+        </w:rPr>
+        <w:t xml:space="preserve">Acum trebuie să șterg și restul conținutului HTML inutil din fișier — verificam unde se termină:</w:t>
+      </w:r>
+    </w:p>
+    <w:p>
+      <w:pPr>
+        <w:pBdr>
+          <w:bottom w:val="single" w:color="E5E7EB" w:sz="1"/>
+        </w:pBdr>
+        <w:spacing w:after="200"/>
+      </w:pPr>
+    </w:p>
+    <w:p>
+      <w:pPr>
+        <w:spacing w:after="100" w:before="300"/>
+      </w:pPr>
+      <w:r>
+        <w:rPr>
+          <w:b/>
+          <w:bCs/>
+          <w:color w:val="065F46"/>
+          <w:sz w:val="22"/>
+          <w:szCs w:val="22"/>
+        </w:rPr>
+        <w:t xml:space="preserve">🤖 Claude</w:t>
+      </w:r>
+    </w:p>
+    <w:p>
+      <w:pPr>
+        <w:spacing w:after="60"/>
+      </w:pPr>
+      <w:r>
+        <w:rPr>
+          <w:rFonts w:ascii="DejaVu Sans" w:cs="DejaVu Sans" w:eastAsia="DejaVu Sans" w:hAnsi="DejaVu Sans"/>
+          <w:color w:val="111827"/>
+          <w:sz w:val="20"/>
+          <w:szCs w:val="20"/>
+        </w:rPr>
+        <w:t xml:space="preserve">Șterg tot ce e după linia 506 (codul HTML inutil):</w:t>
+      </w:r>
+    </w:p>
+    <w:p>
+      <w:pPr>
+        <w:pBdr>
+          <w:bottom w:val="single" w:color="E5E7EB" w:sz="1"/>
+        </w:pBdr>
+        <w:spacing w:after="200"/>
+      </w:pPr>
+    </w:p>
+    <w:p>
+      <w:pPr>
+        <w:spacing w:after="100" w:before="300"/>
+      </w:pPr>
+      <w:r>
+        <w:rPr>
+          <w:b/>
+          <w:bCs/>
+          <w:color w:val="065F46"/>
+          <w:sz w:val="22"/>
+          <w:szCs w:val="22"/>
+        </w:rPr>
+        <w:t xml:space="preserve">🤖 Claude</w:t>
+      </w:r>
+    </w:p>
+    <w:p>
+      <w:pPr>
+        <w:spacing w:after="60"/>
+      </w:pPr>
+      <w:r>
+        <w:rPr>
+          <w:rFonts w:ascii="DejaVu Sans" w:cs="DejaVu Sans" w:eastAsia="DejaVu Sans" w:hAnsi="DejaVu Sans"/>
+          <w:color w:val="111827"/>
+          <w:sz w:val="20"/>
+          <w:szCs w:val="20"/>
+        </w:rPr>
+        <w:t xml:space="preserve">Gata! Rezumatul profesionist e generat și salvat:</w:t>
+      </w:r>
+    </w:p>
+    <w:p>
+      <w:pPr>
+        <w:spacing w:after="60"/>
+      </w:pPr>
+      <w:r>
+        <w:rPr>
+          <w:rFonts w:ascii="DejaVu Sans" w:cs="DejaVu Sans" w:eastAsia="DejaVu Sans" w:hAnsi="DejaVu Sans"/>
+          <w:color w:val="111827"/>
+          <w:sz w:val="20"/>
+          <w:szCs w:val="20"/>
+        </w:rPr>
+        <w:t xml:space="preserve"> </w:t>
+      </w:r>
+    </w:p>
+    <w:p>
+      <w:pPr>
+        <w:spacing w:after="60"/>
+      </w:pPr>
+      <w:r>
+        <w:rPr>
+          <w:rFonts w:ascii="DejaVu Sans" w:cs="DejaVu Sans" w:eastAsia="DejaVu Sans" w:hAnsi="DejaVu Sans"/>
+          <w:color w:val="111827"/>
+          <w:sz w:val="20"/>
+          <w:szCs w:val="20"/>
+        </w:rPr>
+        <w:t xml:space="preserve">- [docs/rezumat-proiect.docx](docs/rezumat-proiect.docx)</w:t>
+      </w:r>
+    </w:p>
+    <w:p>
+      <w:pPr>
+        <w:spacing w:after="60"/>
+      </w:pPr>
+      <w:r>
+        <w:rPr>
+          <w:rFonts w:ascii="DejaVu Sans" w:cs="DejaVu Sans" w:eastAsia="DejaVu Sans" w:hAnsi="DejaVu Sans"/>
+          <w:color w:val="111827"/>
+          <w:sz w:val="20"/>
+          <w:szCs w:val="20"/>
+        </w:rPr>
+        <w:t xml:space="preserve">- [docs/rezumat-proiect.pdf](docs/rezumat-proiect.pdf)</w:t>
+      </w:r>
+    </w:p>
+    <w:p>
+      <w:pPr>
+        <w:spacing w:after="60"/>
+      </w:pPr>
+      <w:r>
+        <w:rPr>
+          <w:rFonts w:ascii="DejaVu Sans" w:cs="DejaVu Sans" w:eastAsia="DejaVu Sans" w:hAnsi="DejaVu Sans"/>
+          <w:color w:val="111827"/>
+          <w:sz w:val="20"/>
+          <w:szCs w:val="20"/>
+        </w:rPr>
+        <w:t xml:space="preserve"> </w:t>
+      </w:r>
+    </w:p>
+    <w:p>
+      <w:pPr>
+        <w:spacing w:after="60"/>
+      </w:pPr>
+      <w:r>
+        <w:rPr>
+          <w:rFonts w:ascii="DejaVu Sans" w:cs="DejaVu Sans" w:eastAsia="DejaVu Sans" w:hAnsi="DejaVu Sans"/>
+          <w:color w:val="111827"/>
+          <w:sz w:val="20"/>
+          <w:szCs w:val="20"/>
+        </w:rPr>
+        <w:t xml:space="preserve">Conține 8 secțiuni: Prezentare generală, Stack tehnic, Pagini și funcționalități, Baza de date, SEO, Securitate, Etapele dezvoltării, Concluzie.</w:t>
+      </w:r>
+    </w:p>
+    <w:p>
+      <w:pPr>
+        <w:pBdr>
+          <w:bottom w:val="single" w:color="E5E7EB" w:sz="1"/>
+        </w:pBdr>
+        <w:spacing w:after="200"/>
+      </w:pPr>
+    </w:p>
+    <w:p>
+      <w:pPr>
+        <w:spacing w:after="100" w:before="300"/>
+      </w:pPr>
+      <w:r>
+        <w:rPr>
+          <w:b/>
+          <w:bCs/>
+          <w:color w:val="1D4ED8"/>
+          <w:sz w:val="22"/>
+          <w:szCs w:val="22"/>
+        </w:rPr>
+        <w:t xml:space="preserve">👤 Tu</w:t>
+      </w:r>
+    </w:p>
+    <w:p>
+      <w:pPr>
+        <w:spacing w:after="60"/>
+      </w:pPr>
+      <w:r>
+        <w:rPr>
+          <w:rFonts w:ascii="DejaVu Sans" w:cs="DejaVu Sans" w:eastAsia="DejaVu Sans" w:hAnsi="DejaVu Sans"/>
+          <w:color w:val="111827"/>
+          <w:sz w:val="20"/>
+          <w:szCs w:val="20"/>
+        </w:rPr>
+        <w:t xml:space="preserve">&lt;ide_opened_file&gt;The user opened the file k:\Video-Prelucrat\Vibe Coding\Proiect_01\.env.local in the IDE. This may or may not be related to the current task.&lt;/ide_opened_file&gt;</w:t>
+      </w:r>
+    </w:p>
+    <w:p>
+      <w:pPr>
+        <w:spacing w:after="60"/>
+      </w:pPr>
+      <w:r>
+        <w:rPr>
+          <w:rFonts w:ascii="DejaVu Sans" w:cs="DejaVu Sans" w:eastAsia="DejaVu Sans" w:hAnsi="DejaVu Sans"/>
+          <w:color w:val="111827"/>
+          <w:sz w:val="20"/>
+          <w:szCs w:val="20"/>
+        </w:rPr>
+        <w:t xml:space="preserve">Acum vreau să facem documentația proiectului(logică,profesionistp, pedagogică) pentru a fi prezentată prpfesorului.</w:t>
+      </w:r>
+    </w:p>
+    <w:p>
+      <w:pPr>
+        <w:pBdr>
+          <w:bottom w:val="single" w:color="E5E7EB" w:sz="1"/>
+        </w:pBdr>
+        <w:spacing w:after="200"/>
+      </w:pPr>
+    </w:p>
+    <w:p>
+      <w:pPr>
+        <w:spacing w:after="100" w:before="300"/>
+      </w:pPr>
+      <w:r>
+        <w:rPr>
+          <w:b/>
+          <w:bCs/>
+          <w:color w:val="065F46"/>
+          <w:sz w:val="22"/>
+          <w:szCs w:val="22"/>
+        </w:rPr>
+        <w:t xml:space="preserve">🤖 Claude</w:t>
+      </w:r>
+    </w:p>
+    <w:p>
+      <w:pPr>
+        <w:spacing w:after="60"/>
+      </w:pPr>
+      <w:r>
+        <w:rPr>
+          <w:rFonts w:ascii="DejaVu Sans" w:cs="DejaVu Sans" w:eastAsia="DejaVu Sans" w:hAnsi="DejaVu Sans"/>
+          <w:color w:val="111827"/>
+          <w:sz w:val="20"/>
+          <w:szCs w:val="20"/>
+        </w:rPr>
+        <w:t xml:space="preserve">Înainte să încep, câteva întrebări rapide ca să fac documentația potrivită:</w:t>
+      </w:r>
+    </w:p>
+    <w:p>
+      <w:pPr>
+        <w:spacing w:after="60"/>
+      </w:pPr>
+      <w:r>
+        <w:rPr>
+          <w:rFonts w:ascii="DejaVu Sans" w:cs="DejaVu Sans" w:eastAsia="DejaVu Sans" w:hAnsi="DejaVu Sans"/>
+          <w:color w:val="111827"/>
+          <w:sz w:val="20"/>
+          <w:szCs w:val="20"/>
+        </w:rPr>
+        <w:t xml:space="preserve"> </w:t>
+      </w:r>
+    </w:p>
+    <w:p>
+      <w:pPr>
+        <w:spacing w:after="60"/>
+      </w:pPr>
+      <w:r>
+        <w:rPr>
+          <w:rFonts w:ascii="DejaVu Sans" w:cs="DejaVu Sans" w:eastAsia="DejaVu Sans" w:hAnsi="DejaVu Sans"/>
+          <w:color w:val="111827"/>
+          <w:sz w:val="20"/>
+          <w:szCs w:val="20"/>
+        </w:rPr>
+        <w:t xml:space="preserve">1. **Ce nivel** are profesorul? (tehnic / non-tehnic / mixt)</w:t>
+      </w:r>
+    </w:p>
+    <w:p>
+      <w:pPr>
+        <w:spacing w:after="60"/>
+      </w:pPr>
+      <w:r>
+        <w:rPr>
+          <w:rFonts w:ascii="DejaVu Sans" w:cs="DejaVu Sans" w:eastAsia="DejaVu Sans" w:hAnsi="DejaVu Sans"/>
+          <w:color w:val="111827"/>
+          <w:sz w:val="20"/>
+          <w:szCs w:val="20"/>
+        </w:rPr>
+        <w:t xml:space="preserve">2. **Ce format** preferă — un singur document lung sau mai multe secțiuni separate?</w:t>
+      </w:r>
+    </w:p>
+    <w:p>
+      <w:pPr>
+        <w:spacing w:after="60"/>
+      </w:pPr>
+      <w:r>
+        <w:rPr>
+          <w:rFonts w:ascii="DejaVu Sans" w:cs="DejaVu Sans" w:eastAsia="DejaVu Sans" w:hAnsi="DejaVu Sans"/>
+          <w:color w:val="111827"/>
+          <w:sz w:val="20"/>
+          <w:szCs w:val="20"/>
+        </w:rPr>
+        <w:t xml:space="preserve">3. **Ce vrei să evidențiezi?** — procesul de învățare (Vibe Coding), codul tehnic, sau ambele?</w:t>
+      </w:r>
+    </w:p>
+    <w:p>
+      <w:pPr>
+        <w:spacing w:after="60"/>
+      </w:pPr>
+      <w:r>
+        <w:rPr>
+          <w:rFonts w:ascii="DejaVu Sans" w:cs="DejaVu Sans" w:eastAsia="DejaVu Sans" w:hAnsi="DejaVu Sans"/>
+          <w:color w:val="111827"/>
+          <w:sz w:val="20"/>
+          <w:szCs w:val="20"/>
+        </w:rPr>
+        <w:t xml:space="preserve">4. **Există o structură cerută** de profesor (ex: introducere, obiective, implementare, concluzii)?</w:t>
+      </w:r>
+    </w:p>
+    <w:p>
+      <w:pPr>
+        <w:pBdr>
+          <w:bottom w:val="single" w:color="E5E7EB" w:sz="1"/>
+        </w:pBdr>
+        <w:spacing w:after="200"/>
+      </w:pPr>
+    </w:p>
+    <w:p>
+      <w:pPr>
+        <w:spacing w:after="100" w:before="300"/>
+      </w:pPr>
+      <w:r>
+        <w:rPr>
+          <w:b/>
+          <w:bCs/>
+          <w:color w:val="1D4ED8"/>
+          <w:sz w:val="22"/>
+          <w:szCs w:val="22"/>
+        </w:rPr>
+        <w:t xml:space="preserve">👤 Tu</w:t>
+      </w:r>
+    </w:p>
+    <w:p>
+      <w:pPr>
+        <w:spacing w:after="60"/>
+      </w:pPr>
+      <w:r>
+        <w:rPr>
+          <w:rFonts w:ascii="DejaVu Sans" w:cs="DejaVu Sans" w:eastAsia="DejaVu Sans" w:hAnsi="DejaVu Sans"/>
+          <w:color w:val="111827"/>
+          <w:sz w:val="20"/>
+          <w:szCs w:val="20"/>
+        </w:rPr>
+        <w:t xml:space="preserve">1. tehnic</w:t>
+      </w:r>
+    </w:p>
+    <w:p>
+      <w:pPr>
+        <w:spacing w:after="60"/>
+      </w:pPr>
+      <w:r>
+        <w:rPr>
+          <w:rFonts w:ascii="DejaVu Sans" w:cs="DejaVu Sans" w:eastAsia="DejaVu Sans" w:hAnsi="DejaVu Sans"/>
+          <w:color w:val="111827"/>
+          <w:sz w:val="20"/>
+          <w:szCs w:val="20"/>
+        </w:rPr>
+        <w:t xml:space="preserve">2. un document</w:t>
+      </w:r>
+    </w:p>
+    <w:p>
+      <w:pPr>
+        <w:spacing w:after="60"/>
+      </w:pPr>
+      <w:r>
+        <w:rPr>
+          <w:rFonts w:ascii="DejaVu Sans" w:cs="DejaVu Sans" w:eastAsia="DejaVu Sans" w:hAnsi="DejaVu Sans"/>
+          <w:color w:val="111827"/>
+          <w:sz w:val="20"/>
+          <w:szCs w:val="20"/>
+        </w:rPr>
+        <w:t xml:space="preserve">3. ambele</w:t>
+      </w:r>
+    </w:p>
+    <w:p>
+      <w:pPr>
+        <w:spacing w:after="60"/>
+      </w:pPr>
+      <w:r>
+        <w:rPr>
+          <w:rFonts w:ascii="DejaVu Sans" w:cs="DejaVu Sans" w:eastAsia="DejaVu Sans" w:hAnsi="DejaVu Sans"/>
+          <w:color w:val="111827"/>
+          <w:sz w:val="20"/>
+          <w:szCs w:val="20"/>
+        </w:rPr>
+        <w:t xml:space="preserve">4. nu</w:t>
+      </w:r>
+    </w:p>
+    <w:p>
+      <w:pPr>
+        <w:pBdr>
+          <w:bottom w:val="single" w:color="E5E7EB" w:sz="1"/>
+        </w:pBdr>
+        <w:spacing w:after="200"/>
+      </w:pPr>
+    </w:p>
+    <w:p>
+      <w:pPr>
+        <w:spacing w:after="100" w:before="300"/>
+      </w:pPr>
+      <w:r>
+        <w:rPr>
+          <w:b/>
+          <w:bCs/>
+          <w:color w:val="065F46"/>
+          <w:sz w:val="22"/>
+          <w:szCs w:val="22"/>
+        </w:rPr>
+        <w:t xml:space="preserve">🤖 Claude</w:t>
+      </w:r>
+    </w:p>
+    <w:p>
+      <w:pPr>
+        <w:spacing w:after="60"/>
+      </w:pPr>
+      <w:r>
+        <w:rPr>
+          <w:rFonts w:ascii="DejaVu Sans" w:cs="DejaVu Sans" w:eastAsia="DejaVu Sans" w:hAnsi="DejaVu Sans"/>
+          <w:color w:val="111827"/>
+          <w:sz w:val="20"/>
+          <w:szCs w:val="20"/>
+        </w:rPr>
+        <w:t xml:space="preserve">Am toate datele. Scriu acum scriptul pentru documentația completă:</w:t>
+      </w:r>
+    </w:p>
+    <w:p>
+      <w:pPr>
+        <w:pBdr>
+          <w:bottom w:val="single" w:color="E5E7EB" w:sz="1"/>
+        </w:pBdr>
+        <w:spacing w:after="200"/>
+      </w:pPr>
+    </w:p>
+    <w:p>
+      <w:pPr>
+        <w:spacing w:after="100" w:before="300"/>
+      </w:pPr>
+      <w:r>
+        <w:rPr>
+          <w:b/>
+          <w:bCs/>
+          <w:color w:val="065F46"/>
+          <w:sz w:val="22"/>
+          <w:szCs w:val="22"/>
+        </w:rPr>
+        <w:t xml:space="preserve">🤖 Claude</w:t>
+      </w:r>
+    </w:p>
+    <w:p>
+      <w:pPr>
+        <w:spacing w:after="60"/>
+      </w:pPr>
+      <w:r>
+        <w:rPr>
+          <w:rFonts w:ascii="DejaVu Sans" w:cs="DejaVu Sans" w:eastAsia="DejaVu Sans" w:hAnsi="DejaVu Sans"/>
+          <w:color w:val="111827"/>
+          <w:sz w:val="20"/>
+          <w:szCs w:val="20"/>
+        </w:rPr>
+        <w:t xml:space="preserve">Am toate datele. Generez documentația acum:</w:t>
+      </w:r>
+    </w:p>
+    <w:p>
+      <w:pPr>
+        <w:pBdr>
+          <w:bottom w:val="single" w:color="E5E7EB" w:sz="1"/>
+        </w:pBdr>
+        <w:spacing w:after="200"/>
+      </w:pPr>
+    </w:p>
+    <w:p>
+      <w:pPr>
+        <w:spacing w:after="100" w:before="300"/>
+      </w:pPr>
+      <w:r>
+        <w:rPr>
+          <w:b/>
+          <w:bCs/>
+          <w:color w:val="065F46"/>
+          <w:sz w:val="22"/>
+          <w:szCs w:val="22"/>
+        </w:rPr>
+        <w:t xml:space="preserve">🤖 Claude</w:t>
+      </w:r>
+    </w:p>
+    <w:p>
+      <w:pPr>
+        <w:spacing w:after="60"/>
+      </w:pPr>
+      <w:r>
+        <w:rPr>
+          <w:rFonts w:ascii="DejaVu Sans" w:cs="DejaVu Sans" w:eastAsia="DejaVu Sans" w:hAnsi="DejaVu Sans"/>
+          <w:color w:val="111827"/>
+          <w:sz w:val="20"/>
+          <w:szCs w:val="20"/>
+        </w:rPr>
+        <w:t xml:space="preserve">Documentația e gata. Conținut:</w:t>
+      </w:r>
+    </w:p>
+    <w:p>
+      <w:pPr>
+        <w:spacing w:after="60"/>
+      </w:pPr>
+      <w:r>
+        <w:rPr>
+          <w:rFonts w:ascii="DejaVu Sans" w:cs="DejaVu Sans" w:eastAsia="DejaVu Sans" w:hAnsi="DejaVu Sans"/>
+          <w:color w:val="111827"/>
+          <w:sz w:val="20"/>
+          <w:szCs w:val="20"/>
+        </w:rPr>
+        <w:t xml:space="preserve"> </w:t>
+      </w:r>
+    </w:p>
+    <w:p>
+      <w:pPr>
+        <w:spacing w:after="60"/>
+      </w:pPr>
+      <w:r>
+        <w:rPr>
+          <w:rFonts w:ascii="DejaVu Sans" w:cs="DejaVu Sans" w:eastAsia="DejaVu Sans" w:hAnsi="DejaVu Sans"/>
+          <w:color w:val="111827"/>
+          <w:sz w:val="20"/>
+          <w:szCs w:val="20"/>
+        </w:rPr>
+        <w:t xml:space="preserve">**11 secțiuni:**</w:t>
+      </w:r>
+    </w:p>
+    <w:p>
+      <w:pPr>
+        <w:spacing w:after="60"/>
+      </w:pPr>
+      <w:r>
+        <w:rPr>
+          <w:rFonts w:ascii="DejaVu Sans" w:cs="DejaVu Sans" w:eastAsia="DejaVu Sans" w:hAnsi="DejaVu Sans"/>
+          <w:color w:val="111827"/>
+          <w:sz w:val="20"/>
+          <w:szCs w:val="20"/>
+        </w:rPr>
+        <w:t xml:space="preserve">1. Introducere și context — obiective pedagogice, metodologia Vibe Coding</w:t>
+      </w:r>
+    </w:p>
+    <w:p>
+      <w:pPr>
+        <w:spacing w:after="60"/>
+      </w:pPr>
+      <w:r>
+        <w:rPr>
+          <w:rFonts w:ascii="DejaVu Sans" w:cs="DejaVu Sans" w:eastAsia="DejaVu Sans" w:hAnsi="DejaVu Sans"/>
+          <w:color w:val="111827"/>
+          <w:sz w:val="20"/>
+          <w:szCs w:val="20"/>
+        </w:rPr>
+        <w:t xml:space="preserve">2. Arhitectura — diagramă componente, server vs. client</w:t>
+      </w:r>
+    </w:p>
+    <w:p>
+      <w:pPr>
+        <w:spacing w:after="60"/>
+      </w:pPr>
+      <w:r>
+        <w:rPr>
+          <w:rFonts w:ascii="DejaVu Sans" w:cs="DejaVu Sans" w:eastAsia="DejaVu Sans" w:hAnsi="DejaVu Sans"/>
+          <w:color w:val="111827"/>
+          <w:sz w:val="20"/>
+          <w:szCs w:val="20"/>
+        </w:rPr>
+        <w:t xml:space="preserve">3. Stack tehnic — tabel cu toate tehnologiile și rolurile lor</w:t>
+      </w:r>
+    </w:p>
+    <w:p>
+      <w:pPr>
+        <w:spacing w:after="60"/>
+      </w:pPr>
+      <w:r>
+        <w:rPr>
+          <w:rFonts w:ascii="DejaVu Sans" w:cs="DejaVu Sans" w:eastAsia="DejaVu Sans" w:hAnsi="DejaVu Sans"/>
+          <w:color w:val="111827"/>
+          <w:sz w:val="20"/>
+          <w:szCs w:val="20"/>
+        </w:rPr>
+        <w:t xml:space="preserve">4. Structura proiectului — arborele complet de fișiere cu explicații</w:t>
+      </w:r>
+    </w:p>
+    <w:p>
+      <w:pPr>
+        <w:spacing w:after="60"/>
+      </w:pPr>
+      <w:r>
+        <w:rPr>
+          <w:rFonts w:ascii="DejaVu Sans" w:cs="DejaVu Sans" w:eastAsia="DejaVu Sans" w:hAnsi="DejaVu Sans"/>
+          <w:color w:val="111827"/>
+          <w:sz w:val="20"/>
+          <w:szCs w:val="20"/>
+        </w:rPr>
+        <w:t xml:space="preserve">5. Pagini și funcționalități — fiecare pagină explicată tehnic</w:t>
+      </w:r>
+    </w:p>
+    <w:p>
+      <w:pPr>
+        <w:spacing w:after="60"/>
+      </w:pPr>
+      <w:r>
+        <w:rPr>
+          <w:rFonts w:ascii="DejaVu Sans" w:cs="DejaVu Sans" w:eastAsia="DejaVu Sans" w:hAnsi="DejaVu Sans"/>
+          <w:color w:val="111827"/>
+          <w:sz w:val="20"/>
+          <w:szCs w:val="20"/>
+        </w:rPr>
+        <w:t xml:space="preserve">6. Baza de date — schema SQL a tuturor tabelelor + cod client Supabase</w:t>
+      </w:r>
+    </w:p>
+    <w:p>
+      <w:pPr>
+        <w:spacing w:after="60"/>
+      </w:pPr>
+      <w:r>
+        <w:rPr>
+          <w:rFonts w:ascii="DejaVu Sans" w:cs="DejaVu Sans" w:eastAsia="DejaVu Sans" w:hAnsi="DejaVu Sans"/>
+          <w:color w:val="111827"/>
+          <w:sz w:val="20"/>
+          <w:szCs w:val="20"/>
+        </w:rPr>
+        <w:t xml:space="preserve">7. Securitate — flux autentificare, cod real, principii aplicate</w:t>
+      </w:r>
+    </w:p>
+    <w:p>
+      <w:pPr>
+        <w:spacing w:after="60"/>
+      </w:pPr>
+      <w:r>
+        <w:rPr>
+          <w:rFonts w:ascii="DejaVu Sans" w:cs="DejaVu Sans" w:eastAsia="DejaVu Sans" w:hAnsi="DejaVu Sans"/>
+          <w:color w:val="111827"/>
+          <w:sz w:val="20"/>
+          <w:szCs w:val="20"/>
+        </w:rPr>
+        <w:t xml:space="preserve">8. SEO tehnic — metadata, JSON-LD, robots.txt cu cod</w:t>
+      </w:r>
+    </w:p>
+    <w:p>
+      <w:pPr>
+        <w:spacing w:after="60"/>
+      </w:pPr>
+      <w:r>
+        <w:rPr>
+          <w:rFonts w:ascii="DejaVu Sans" w:cs="DejaVu Sans" w:eastAsia="DejaVu Sans" w:hAnsi="DejaVu Sans"/>
+          <w:color w:val="111827"/>
+          <w:sz w:val="20"/>
+          <w:szCs w:val="20"/>
+        </w:rPr>
+        <w:t xml:space="preserve">9. Deployment CI/CD — fluxul GitHub → Vercel</w:t>
+      </w:r>
+    </w:p>
+    <w:p>
+      <w:pPr>
+        <w:spacing w:after="60"/>
+      </w:pPr>
+      <w:r>
+        <w:rPr>
+          <w:rFonts w:ascii="DejaVu Sans" w:cs="DejaVu Sans" w:eastAsia="DejaVu Sans" w:hAnsi="DejaVu Sans"/>
+          <w:color w:val="111827"/>
+          <w:sz w:val="20"/>
+          <w:szCs w:val="20"/>
+        </w:rPr>
+        <w:t xml:space="preserve">10. Procesul de învățare — sprinturi, concepte cheie asimilate</w:t>
+      </w:r>
+    </w:p>
+    <w:p>
+      <w:pPr>
+        <w:spacing w:after="60"/>
+      </w:pPr>
+      <w:r>
+        <w:rPr>
+          <w:rFonts w:ascii="DejaVu Sans" w:cs="DejaVu Sans" w:eastAsia="DejaVu Sans" w:hAnsi="DejaVu Sans"/>
+          <w:color w:val="111827"/>
+          <w:sz w:val="20"/>
+          <w:szCs w:val="20"/>
+        </w:rPr>
+        <w:t xml:space="preserve">11. Concluzii — realizări, lecții, îmbunătățiri viitoare</w:t>
+      </w:r>
+    </w:p>
+    <w:p>
+      <w:pPr>
+        <w:spacing w:after="60"/>
+      </w:pPr>
+      <w:r>
+        <w:rPr>
+          <w:rFonts w:ascii="DejaVu Sans" w:cs="DejaVu Sans" w:eastAsia="DejaVu Sans" w:hAnsi="DejaVu Sans"/>
+          <w:color w:val="111827"/>
+          <w:sz w:val="20"/>
+          <w:szCs w:val="20"/>
+        </w:rPr>
+        <w:t xml:space="preserve"> </w:t>
+      </w:r>
+    </w:p>
+    <w:p>
+      <w:pPr>
+        <w:spacing w:after="60"/>
+      </w:pPr>
+      <w:r>
+        <w:rPr>
+          <w:rFonts w:ascii="DejaVu Sans" w:cs="DejaVu Sans" w:eastAsia="DejaVu Sans" w:hAnsi="DejaVu Sans"/>
+          <w:color w:val="111827"/>
+          <w:sz w:val="20"/>
+          <w:szCs w:val="20"/>
+        </w:rPr>
+        <w:t xml:space="preserve">Fișiere: [docs/documentatie-profesor.docx](docs/documentatie-profesor.docx) și [docs/documentatie-profesor.pdf](docs/documentatie-profesor.pdf)</w:t>
+      </w:r>
+    </w:p>
+    <w:p>
+      <w:pPr>
+        <w:pBdr>
+          <w:bottom w:val="single" w:color="E5E7EB" w:sz="1"/>
+        </w:pBdr>
+        <w:spacing w:after="200"/>
+      </w:pPr>
+    </w:p>
+    <w:p>
+      <w:pPr>
+        <w:spacing w:after="100" w:before="300"/>
+      </w:pPr>
+      <w:r>
+        <w:rPr>
+          <w:b/>
+          <w:bCs/>
+          <w:color w:val="1D4ED8"/>
+          <w:sz w:val="22"/>
+          <w:szCs w:val="22"/>
+        </w:rPr>
+        <w:t xml:space="preserve">👤 Tu</w:t>
+      </w:r>
+    </w:p>
+    <w:p>
+      <w:pPr>
+        <w:spacing w:after="60"/>
+      </w:pPr>
+      <w:r>
+        <w:rPr>
+          <w:rFonts w:ascii="DejaVu Sans" w:cs="DejaVu Sans" w:eastAsia="DejaVu Sans" w:hAnsi="DejaVu Sans"/>
+          <w:color w:val="111827"/>
+          <w:sz w:val="20"/>
+          <w:szCs w:val="20"/>
+        </w:rPr>
+        <w:t xml:space="preserve">ok. Salvează tot</w:t>
+      </w:r>
+    </w:p>
+    <w:p>
+      <w:pPr>
+        <w:pBdr>
+          <w:bottom w:val="single" w:color="E5E7EB" w:sz="1"/>
+        </w:pBdr>
+        <w:spacing w:after="200"/>
+      </w:pPr>
+    </w:p>
+    <w:p>
+      <w:pPr>
+        <w:spacing w:after="100" w:before="300"/>
+      </w:pPr>
+      <w:r>
+        <w:rPr>
+          <w:b/>
+          <w:bCs/>
+          <w:color w:val="065F46"/>
+          <w:sz w:val="22"/>
+          <w:szCs w:val="22"/>
+        </w:rPr>
+        <w:t xml:space="preserve">🤖 Claude</w:t>
+      </w:r>
+    </w:p>
+    <w:p>
+      <w:pPr>
+        <w:spacing w:after="60"/>
+      </w:pPr>
+      <w:r>
+        <w:rPr>
+          <w:rFonts w:ascii="DejaVu Sans" w:cs="DejaVu Sans" w:eastAsia="DejaVu Sans" w:hAnsi="DejaVu Sans"/>
+          <w:color w:val="111827"/>
+          <w:sz w:val="20"/>
+          <w:szCs w:val="20"/>
+        </w:rPr>
+        <w:t xml:space="preserve">Totul e deja salvat pe GitHub. Singurul fișier neadăugat e PDF-ul cu emailul de la Gmail — îl lăsăm afară.</w:t>
+      </w:r>
+    </w:p>
+    <w:p>
+      <w:pPr>
+        <w:pBdr>
+          <w:bottom w:val="single" w:color="E5E7EB" w:sz="1"/>
+        </w:pBdr>
+        <w:spacing w:after="200"/>
+      </w:pPr>
+    </w:p>
+    <w:p>
+      <w:pPr>
+        <w:spacing w:after="100" w:before="300"/>
+      </w:pPr>
+      <w:r>
+        <w:rPr>
+          <w:b/>
+          <w:bCs/>
+          <w:color w:val="1D4ED8"/>
+          <w:sz w:val="22"/>
+          <w:szCs w:val="22"/>
+        </w:rPr>
+        <w:t xml:space="preserve">👤 Tu</w:t>
+      </w:r>
+    </w:p>
+    <w:p>
+      <w:pPr>
+        <w:spacing w:after="60"/>
+      </w:pPr>
+      <w:r>
+        <w:rPr>
+          <w:rFonts w:ascii="DejaVu Sans" w:cs="DejaVu Sans" w:eastAsia="DejaVu Sans" w:hAnsi="DejaVu Sans"/>
+          <w:color w:val="111827"/>
+          <w:sz w:val="20"/>
+          <w:szCs w:val="20"/>
+        </w:rPr>
+        <w:t xml:space="preserve">salvează-l</w:t>
+      </w:r>
+    </w:p>
+    <w:p>
+      <w:pPr>
+        <w:pBdr>
+          <w:bottom w:val="single" w:color="E5E7EB" w:sz="1"/>
+        </w:pBdr>
+        <w:spacing w:after="200"/>
+      </w:pPr>
+    </w:p>
+    <w:p>
+      <w:pPr>
+        <w:spacing w:after="100" w:before="300"/>
+      </w:pPr>
+      <w:r>
+        <w:rPr>
+          <w:b/>
+          <w:bCs/>
+          <w:color w:val="065F46"/>
+          <w:sz w:val="22"/>
+          <w:szCs w:val="22"/>
+        </w:rPr>
+        <w:t xml:space="preserve">🤖 Claude</w:t>
+      </w:r>
+    </w:p>
+    <w:p>
+      <w:pPr>
+        <w:spacing w:after="60"/>
+      </w:pPr>
+      <w:r>
+        <w:rPr>
+          <w:rFonts w:ascii="DejaVu Sans" w:cs="DejaVu Sans" w:eastAsia="DejaVu Sans" w:hAnsi="DejaVu Sans"/>
+          <w:color w:val="111827"/>
+          <w:sz w:val="20"/>
+          <w:szCs w:val="20"/>
+        </w:rPr>
+        <w:t xml:space="preserve">Gata, salvat pe GitHub.</w:t>
+      </w:r>
+    </w:p>
+    <w:p>
+      <w:pPr>
+        <w:pBdr>
+          <w:bottom w:val="single" w:color="E5E7EB" w:sz="1"/>
+        </w:pBdr>
+        <w:spacing w:after="200"/>
+      </w:pPr>
+    </w:p>
+    <w:p>
+      <w:pPr>
+        <w:spacing w:after="100" w:before="300"/>
+      </w:pPr>
+      <w:r>
+        <w:rPr>
+          <w:b/>
+          <w:bCs/>
+          <w:color w:val="1D4ED8"/>
+          <w:sz w:val="22"/>
+          <w:szCs w:val="22"/>
+        </w:rPr>
+        <w:t xml:space="preserve">👤 Tu</w:t>
+      </w:r>
+    </w:p>
+    <w:p>
+      <w:pPr>
+        <w:spacing w:after="60"/>
+      </w:pPr>
+      <w:r>
+        <w:rPr>
+          <w:rFonts w:ascii="DejaVu Sans" w:cs="DejaVu Sans" w:eastAsia="DejaVu Sans" w:hAnsi="DejaVu Sans"/>
+          <w:color w:val="111827"/>
+          <w:sz w:val="20"/>
+          <w:szCs w:val="20"/>
+        </w:rPr>
+        <w:t xml:space="preserve">&lt;command-message&gt;end&lt;/command-message&gt;</w:t>
+      </w:r>
+    </w:p>
+    <w:p>
+      <w:pPr>
+        <w:spacing w:after="60"/>
+      </w:pPr>
+      <w:r>
+        <w:rPr>
+          <w:rFonts w:ascii="DejaVu Sans" w:cs="DejaVu Sans" w:eastAsia="DejaVu Sans" w:hAnsi="DejaVu Sans"/>
+          <w:color w:val="111827"/>
+          <w:sz w:val="20"/>
+          <w:szCs w:val="20"/>
+        </w:rPr>
+        <w:t xml:space="preserve">&lt;command-name&gt;/end&lt;/command-name&gt;</w:t>
+      </w:r>
+    </w:p>
+    <w:p>
+      <w:pPr>
+        <w:pBdr>
+          <w:bottom w:val="single" w:color="E5E7EB" w:sz="1"/>
+        </w:pBdr>
+        <w:spacing w:after="200"/>
+      </w:pPr>
+    </w:p>
+    <w:p>
+      <w:pPr>
+        <w:spacing w:after="100" w:before="300"/>
+      </w:pPr>
+      <w:r>
+        <w:rPr>
+          <w:b/>
+          <w:bCs/>
+          <w:color w:val="1D4ED8"/>
+          <w:sz w:val="22"/>
+          <w:szCs w:val="22"/>
+        </w:rPr>
+        <w:t xml:space="preserve">👤 Tu</w:t>
+      </w:r>
+    </w:p>
+    <w:p>
+      <w:pPr>
+        <w:spacing w:after="60"/>
+      </w:pPr>
+      <w:r>
+        <w:rPr>
+          <w:rFonts w:ascii="DejaVu Sans" w:cs="DejaVu Sans" w:eastAsia="DejaVu Sans" w:hAnsi="DejaVu Sans"/>
+          <w:color w:val="111827"/>
+          <w:sz w:val="20"/>
+          <w:szCs w:val="20"/>
+        </w:rPr>
+        <w:t xml:space="preserve"># /end - Sfarsitul sesiunii de lucru</w:t>
+      </w:r>
+    </w:p>
+    <w:p>
+      <w:pPr>
+        <w:spacing w:after="60"/>
+      </w:pPr>
+      <w:r>
+        <w:rPr>
+          <w:rFonts w:ascii="DejaVu Sans" w:cs="DejaVu Sans" w:eastAsia="DejaVu Sans" w:hAnsi="DejaVu Sans"/>
+          <w:color w:val="111827"/>
+          <w:sz w:val="20"/>
+          <w:szCs w:val="20"/>
+        </w:rPr>
+        <w:t xml:space="preserve"> </w:t>
+      </w:r>
+    </w:p>
+    <w:p>
+      <w:pPr>
+        <w:spacing w:after="60"/>
+      </w:pPr>
+      <w:r>
+        <w:rPr>
+          <w:rFonts w:ascii="DejaVu Sans" w:cs="DejaVu Sans" w:eastAsia="DejaVu Sans" w:hAnsi="DejaVu Sans"/>
+          <w:color w:val="111827"/>
+          <w:sz w:val="20"/>
+          <w:szCs w:val="20"/>
+        </w:rPr>
+        <w:t xml:space="preserve">Ruleaza la finalul fiecarei sesiuni:</w:t>
+      </w:r>
+    </w:p>
+    <w:p>
+      <w:pPr>
+        <w:spacing w:after="60"/>
+      </w:pPr>
+      <w:r>
+        <w:rPr>
+          <w:rFonts w:ascii="DejaVu Sans" w:cs="DejaVu Sans" w:eastAsia="DejaVu Sans" w:hAnsi="DejaVu Sans"/>
+          <w:color w:val="111827"/>
+          <w:sz w:val="20"/>
+          <w:szCs w:val="20"/>
+        </w:rPr>
+        <w:t xml:space="preserve"> </w:t>
+      </w:r>
+    </w:p>
+    <w:p>
+      <w:pPr>
+        <w:spacing w:after="60"/>
+      </w:pPr>
+      <w:r>
+        <w:rPr>
+          <w:rFonts w:ascii="DejaVu Sans" w:cs="DejaVu Sans" w:eastAsia="DejaVu Sans" w:hAnsi="DejaVu Sans"/>
+          <w:color w:val="111827"/>
+          <w:sz w:val="20"/>
+          <w:szCs w:val="20"/>
+        </w:rPr>
+        <w:t xml:space="preserve">1. Verifica daca sunt modificari nesalvate</w:t>
+      </w:r>
+    </w:p>
+    <w:p>
+      <w:pPr>
+        <w:spacing w:after="60"/>
+      </w:pPr>
+      <w:r>
+        <w:rPr>
+          <w:rFonts w:ascii="DejaVu Sans" w:cs="DejaVu Sans" w:eastAsia="DejaVu Sans" w:hAnsi="DejaVu Sans"/>
+          <w:color w:val="111827"/>
+          <w:sz w:val="20"/>
+          <w:szCs w:val="20"/>
+        </w:rPr>
+        <w:t xml:space="preserve">2. Daca da, intreaba userul daca vrea sa faca commit</w:t>
+      </w:r>
+    </w:p>
+    <w:p>
+      <w:pPr>
+        <w:spacing w:after="60"/>
+      </w:pPr>
+      <w:r>
+        <w:rPr>
+          <w:rFonts w:ascii="DejaVu Sans" w:cs="DejaVu Sans" w:eastAsia="DejaVu Sans" w:hAnsi="DejaVu Sans"/>
+          <w:color w:val="111827"/>
+          <w:sz w:val="20"/>
+          <w:szCs w:val="20"/>
+        </w:rPr>
+        <w:t xml:space="preserve">3. Verifica daca sunt commit-uri nepush-uite</w:t>
+      </w:r>
+    </w:p>
+    <w:p>
+      <w:pPr>
+        <w:spacing w:after="60"/>
+      </w:pPr>
+      <w:r>
+        <w:rPr>
+          <w:rFonts w:ascii="DejaVu Sans" w:cs="DejaVu Sans" w:eastAsia="DejaVu Sans" w:hAnsi="DejaVu Sans"/>
+          <w:color w:val="111827"/>
+          <w:sz w:val="20"/>
+          <w:szCs w:val="20"/>
+        </w:rPr>
+        <w:t xml:space="preserve">4. Daca da, intreaba userul daca vrea sa faca push</w:t>
+      </w:r>
+    </w:p>
+    <w:p>
+      <w:pPr>
+        <w:spacing w:after="60"/>
+      </w:pPr>
+      <w:r>
+        <w:rPr>
+          <w:rFonts w:ascii="DejaVu Sans" w:cs="DejaVu Sans" w:eastAsia="DejaVu Sans" w:hAnsi="DejaVu Sans"/>
+          <w:color w:val="111827"/>
+          <w:sz w:val="20"/>
+          <w:szCs w:val="20"/>
+        </w:rPr>
+        <w:t xml:space="preserve">5. Rezuma ce s-a lucrat in sesiune</w:t>
+      </w:r>
+    </w:p>
+    <w:p>
+      <w:pPr>
+        <w:spacing w:after="60"/>
+      </w:pPr>
+      <w:r>
+        <w:rPr>
+          <w:rFonts w:ascii="DejaVu Sans" w:cs="DejaVu Sans" w:eastAsia="DejaVu Sans" w:hAnsi="DejaVu Sans"/>
+          <w:color w:val="111827"/>
+          <w:sz w:val="20"/>
+          <w:szCs w:val="20"/>
+        </w:rPr>
+        <w:t xml:space="preserve">6. Întreabă userul dacă există un to do list pentru sesiunea viitoare.</w:t>
+      </w:r>
+    </w:p>
+    <w:p>
+      <w:pPr>
+        <w:spacing w:after="60"/>
+      </w:pPr>
+      <w:r>
+        <w:rPr>
+          <w:rFonts w:ascii="DejaVu Sans" w:cs="DejaVu Sans" w:eastAsia="DejaVu Sans" w:hAnsi="DejaVu Sans"/>
+          <w:color w:val="111827"/>
+          <w:sz w:val="20"/>
+          <w:szCs w:val="20"/>
+        </w:rPr>
+        <w:t xml:space="preserve">7. Salvează tot ce este nevoie pentru global memory și ce e specific de salvat pentru proiect</w:t>
+      </w:r>
+    </w:p>
+    <w:p>
+      <w:pPr>
+        <w:spacing w:after="60"/>
+      </w:pPr>
+      <w:r>
+        <w:rPr>
+          <w:rFonts w:ascii="DejaVu Sans" w:cs="DejaVu Sans" w:eastAsia="DejaVu Sans" w:hAnsi="DejaVu Sans"/>
+          <w:color w:val="111827"/>
+          <w:sz w:val="20"/>
+          <w:szCs w:val="20"/>
+        </w:rPr>
+        <w:t xml:space="preserve">8. Exportă sesiunea curentă în DOCX și PDF rulând: `node scripts/export-chat.mjs` din directorul proiectului</w:t>
+      </w:r>
+    </w:p>
+    <w:p>
+      <w:pPr>
+        <w:pBdr>
+          <w:bottom w:val="single" w:color="E5E7EB" w:sz="1"/>
+        </w:pBdr>
+        <w:spacing w:after="200"/>
+      </w:pPr>
+    </w:p>
+    <w:p>
+      <w:pPr>
+        <w:spacing w:after="100" w:before="300"/>
+      </w:pPr>
+      <w:r>
+        <w:rPr>
+          <w:b/>
+          <w:bCs/>
+          <w:color w:val="065F46"/>
+          <w:sz w:val="22"/>
+          <w:szCs w:val="22"/>
+        </w:rPr>
+        <w:t xml:space="preserve">🤖 Claude</w:t>
+      </w:r>
+    </w:p>
+    <w:p>
+      <w:pPr>
+        <w:spacing w:after="60"/>
+      </w:pPr>
+      <w:r>
+        <w:rPr>
+          <w:rFonts w:ascii="DejaVu Sans" w:cs="DejaVu Sans" w:eastAsia="DejaVu Sans" w:hAnsi="DejaVu Sans"/>
+          <w:color w:val="111827"/>
+          <w:sz w:val="20"/>
+          <w:szCs w:val="20"/>
+        </w:rPr>
+        <w:t xml:space="preserve">Totul e salvat și pushat. Rezumat sesiune:</w:t>
+      </w:r>
+    </w:p>
+    <w:p>
+      <w:pPr>
+        <w:spacing w:after="60"/>
+      </w:pPr>
+      <w:r>
+        <w:rPr>
+          <w:rFonts w:ascii="DejaVu Sans" w:cs="DejaVu Sans" w:eastAsia="DejaVu Sans" w:hAnsi="DejaVu Sans"/>
+          <w:color w:val="111827"/>
+          <w:sz w:val="20"/>
+          <w:szCs w:val="20"/>
+        </w:rPr>
+        <w:t xml:space="preserve"> </w:t>
+      </w:r>
+    </w:p>
+    <w:p>
+      <w:pPr>
+        <w:spacing w:after="60"/>
+      </w:pPr>
+      <w:r>
+        <w:rPr>
+          <w:rFonts w:ascii="DejaVu Sans" w:cs="DejaVu Sans" w:eastAsia="DejaVu Sans" w:hAnsi="DejaVu Sans"/>
+          <w:color w:val="111827"/>
+          <w:sz w:val="20"/>
+          <w:szCs w:val="20"/>
+        </w:rPr>
+        <w:t xml:space="preserve">---</w:t>
+      </w:r>
+    </w:p>
+    <w:p>
+      <w:pPr>
+        <w:spacing w:after="60"/>
+      </w:pPr>
+      <w:r>
+        <w:rPr>
+          <w:rFonts w:ascii="DejaVu Sans" w:cs="DejaVu Sans" w:eastAsia="DejaVu Sans" w:hAnsi="DejaVu Sans"/>
+          <w:color w:val="111827"/>
+          <w:sz w:val="20"/>
+          <w:szCs w:val="20"/>
+        </w:rPr>
+        <w:t xml:space="preserve"> </w:t>
+      </w:r>
+    </w:p>
+    <w:p>
+      <w:pPr>
+        <w:spacing w:after="60"/>
+      </w:pPr>
+      <w:r>
+        <w:rPr>
+          <w:rFonts w:ascii="DejaVu Sans" w:cs="DejaVu Sans" w:eastAsia="DejaVu Sans" w:hAnsi="DejaVu Sans"/>
+          <w:color w:val="111827"/>
+          <w:sz w:val="20"/>
+          <w:szCs w:val="20"/>
+        </w:rPr>
+        <w:t xml:space="preserve">**Ce s-a lucrat azi:**</w:t>
+      </w:r>
+    </w:p>
+    <w:p>
+      <w:pPr>
+        <w:spacing w:after="60"/>
+      </w:pPr>
+      <w:r>
+        <w:rPr>
+          <w:rFonts w:ascii="DejaVu Sans" w:cs="DejaVu Sans" w:eastAsia="DejaVu Sans" w:hAnsi="DejaVu Sans"/>
+          <w:color w:val="111827"/>
+          <w:sz w:val="20"/>
+          <w:szCs w:val="20"/>
+        </w:rPr>
+        <w:t xml:space="preserve"> </w:t>
+      </w:r>
+    </w:p>
+    <w:p>
+      <w:pPr>
+        <w:spacing w:after="60"/>
+      </w:pPr>
+      <w:r>
+        <w:rPr>
+          <w:rFonts w:ascii="DejaVu Sans" w:cs="DejaVu Sans" w:eastAsia="DejaVu Sans" w:hAnsi="DejaVu Sans"/>
+          <w:color w:val="111827"/>
+          <w:sz w:val="20"/>
+          <w:szCs w:val="20"/>
+        </w:rPr>
+        <w:t xml:space="preserve">- Fix `Footer.tsx` + `FooterStarter.tsx`: "Vibe Coffee" → "Vibe Caffè" + link Meniu `#menu` → `/meniu`</w:t>
+      </w:r>
+    </w:p>
+    <w:p>
+      <w:pPr>
+        <w:spacing w:after="60"/>
+      </w:pPr>
+      <w:r>
+        <w:rPr>
+          <w:rFonts w:ascii="DejaVu Sans" w:cs="DejaVu Sans" w:eastAsia="DejaVu Sans" w:hAnsi="DejaVu Sans"/>
+          <w:color w:val="111827"/>
+          <w:sz w:val="20"/>
+          <w:szCs w:val="20"/>
+        </w:rPr>
+        <w:t xml:space="preserve">- Documente salvate în repo: structura proiect, rapoarte, sesiuni, script gen-structura</w:t>
+      </w:r>
+    </w:p>
+    <w:p>
+      <w:pPr>
+        <w:spacing w:after="60"/>
+      </w:pPr>
+      <w:r>
+        <w:rPr>
+          <w:rFonts w:ascii="DejaVu Sans" w:cs="DejaVu Sans" w:eastAsia="DejaVu Sans" w:hAnsi="DejaVu Sans"/>
+          <w:color w:val="111827"/>
+          <w:sz w:val="20"/>
+          <w:szCs w:val="20"/>
+        </w:rPr>
+        <w:t xml:space="preserve">- Generat `rezumat-proiect.docx/pdf` — rezumat profesionist al întregului proiect</w:t>
+      </w:r>
+    </w:p>
+    <w:p>
+      <w:pPr>
+        <w:spacing w:after="60"/>
+      </w:pPr>
+      <w:r>
+        <w:rPr>
+          <w:rFonts w:ascii="DejaVu Sans" w:cs="DejaVu Sans" w:eastAsia="DejaVu Sans" w:hAnsi="DejaVu Sans"/>
+          <w:color w:val="111827"/>
+          <w:sz w:val="20"/>
+          <w:szCs w:val="20"/>
+        </w:rPr>
+        <w:t xml:space="preserve">- Generat `documentatie-profesor.docx/pdf` — documentație tehnică + pedagogică completă (11 secțiuni)</w:t>
       </w:r>
     </w:p>
     <w:p>

</xml_diff>